<commit_message>
WIP: preserve uncommitted worktree state (2026-09-05)
Snapshot taken during a repo-wide branch cleanup so this work is durable
and pushable. Not reviewed; not intended for merge as-is.

Co-Authored-By: Claude Opus 5 <noreply@anthropic.com>
</commit_message>
<xml_diff>
--- a/docs/specification/Witness Tree Implementation Plan.docx
+++ b/docs/specification/Witness Tree Implementation Plan.docx
@@ -45,7 +45,7 @@
           <w:sz w:val="19"/>
           <w:szCs w:val="19"/>
         </w:rPr>
-        <w:t xml:space="preserve">Version 2. Supersedes Forest Observatory, version 1, dated 2026-08-11.</w:t>
+        <w:t>Version 2.1. Supersedes Forest Observatory, version 1, dated 2026-08-11. Scope amendment approved 2026-08-25.</w:t>
       </w:r>
     </w:p>
     <w:tbl>
@@ -142,21 +142,8 @@
             </w:tcMar>
           </w:tcPr>
           <w:p>
-            <w:pPr>
-              <w:spacing w:after="0" w:line="240"/>
-            </w:pPr>
-            <w:r>
-              <w:rPr>
-                <w:rFonts w:ascii="Trebuchet MS" w:cs="Trebuchet MS" w:eastAsia="Trebuchet MS" w:hAnsi="Trebuchet MS"/>
-                <w:b w:val="false"/>
-                <w:bCs w:val="false"/>
-                <w:i w:val="false"/>
-                <w:iCs w:val="false"/>
-                <w:color w:val="14201A"/>
-                <w:sz w:val="18"/>
-                <w:szCs w:val="18"/>
-              </w:rPr>
-              <w:t xml:space="preserve">Status</w:t>
+            <w:r>
+              <w:t>Status</w:t>
             </w:r>
           </w:p>
         </w:tc>
@@ -172,21 +159,8 @@
             </w:tcMar>
           </w:tcPr>
           <w:p>
-            <w:pPr>
-              <w:spacing w:after="0" w:line="240"/>
-            </w:pPr>
-            <w:r>
-              <w:rPr>
-                <w:rFonts w:ascii="Trebuchet MS" w:cs="Trebuchet MS" w:eastAsia="Trebuchet MS" w:hAnsi="Trebuchet MS"/>
-                <w:b w:val="false"/>
-                <w:bCs w:val="false"/>
-                <w:i w:val="false"/>
-                <w:iCs w:val="false"/>
-                <w:color w:val="14201A"/>
-                <w:sz w:val="18"/>
-                <w:szCs w:val="18"/>
-              </w:rPr>
-              <w:t xml:space="preserve">Approved for build. This document is the build specification.</w:t>
+            <w:r>
+              <w:t>Approved for build. Version 2.1 is the controlling build specification.</w:t>
             </w:r>
           </w:p>
         </w:tc>
@@ -328,21 +302,8 @@
             </w:tcMar>
           </w:tcPr>
           <w:p>
-            <w:pPr>
-              <w:spacing w:after="0" w:line="240"/>
-            </w:pPr>
-            <w:r>
-              <w:rPr>
-                <w:rFonts w:ascii="Trebuchet MS" w:cs="Trebuchet MS" w:eastAsia="Trebuchet MS" w:hAnsi="Trebuchet MS"/>
-                <w:b w:val="false"/>
-                <w:bCs w:val="false"/>
-                <w:i w:val="false"/>
-                <w:iCs w:val="false"/>
-                <w:color w:val="14201A"/>
-                <w:sz w:val="18"/>
-                <w:szCs w:val="18"/>
-              </w:rPr>
-              <w:t xml:space="preserve">Provinces</w:t>
+            <w:r>
+              <w:t>Coverage</w:t>
             </w:r>
           </w:p>
         </w:tc>
@@ -358,21 +319,8 @@
             </w:tcMar>
           </w:tcPr>
           <w:p>
-            <w:pPr>
-              <w:spacing w:after="0" w:line="240"/>
-            </w:pPr>
-            <w:r>
-              <w:rPr>
-                <w:rFonts w:ascii="Trebuchet MS" w:cs="Trebuchet MS" w:eastAsia="Trebuchet MS" w:hAnsi="Trebuchet MS"/>
-                <w:b w:val="false"/>
-                <w:bCs w:val="false"/>
-                <w:i w:val="false"/>
-                <w:iCs w:val="false"/>
-                <w:color w:val="14201A"/>
-                <w:sz w:val="18"/>
-                <w:szCs w:val="18"/>
-              </w:rPr>
-              <w:t xml:space="preserve">British Columbia, Alberta, Ontario, Quebec.</w:t>
+            <w:r>
+              <w:t>National baseline for all Canada, including British Columbia, Alberta, Ontario and Quebec. Enhanced provincial detail is added only where cleared sources support it.</w:t>
             </w:r>
           </w:p>
         </w:tc>
@@ -390,21 +338,8 @@
             </w:tcMar>
           </w:tcPr>
           <w:p>
-            <w:pPr>
-              <w:spacing w:after="0" w:line="240"/>
-            </w:pPr>
-            <w:r>
-              <w:rPr>
-                <w:rFonts w:ascii="Trebuchet MS" w:cs="Trebuchet MS" w:eastAsia="Trebuchet MS" w:hAnsi="Trebuchet MS"/>
-                <w:b w:val="false"/>
-                <w:bCs w:val="false"/>
-                <w:i w:val="false"/>
-                <w:iCs w:val="false"/>
-                <w:color w:val="14201A"/>
-                <w:sz w:val="18"/>
-                <w:szCs w:val="18"/>
-              </w:rPr>
-              <w:t xml:space="preserve">Record period</w:t>
+            <w:r>
+              <w:t>Record period</w:t>
             </w:r>
           </w:p>
         </w:tc>
@@ -420,21 +355,8 @@
             </w:tcMar>
           </w:tcPr>
           <w:p>
-            <w:pPr>
-              <w:spacing w:after="0" w:line="240"/>
-            </w:pPr>
-            <w:r>
-              <w:rPr>
-                <w:rFonts w:ascii="Trebuchet MS" w:cs="Trebuchet MS" w:eastAsia="Trebuchet MS" w:hAnsi="Trebuchet MS"/>
-                <w:b w:val="false"/>
-                <w:bCs w:val="false"/>
-                <w:i w:val="false"/>
-                <w:iCs w:val="false"/>
-                <w:color w:val="14201A"/>
-                <w:sz w:val="18"/>
-                <w:szCs w:val="18"/>
-              </w:rPr>
-              <w:t xml:space="preserve">1984 to present. The public time slider opens at 2000 by default.</w:t>
+            <w:r>
+              <w:t>1984 to the latest admitted source year. Public national artifacts use four-year snapshots from 1984 through 2020 plus 2022, with change summarized between adjacent snapshots.</w:t>
             </w:r>
           </w:p>
         </w:tc>
@@ -762,21 +684,8 @@
             </w:tcMar>
           </w:tcPr>
           <w:p>
-            <w:pPr>
-              <w:spacing w:after="0" w:line="240"/>
-            </w:pPr>
-            <w:r>
-              <w:rPr>
-                <w:rFonts w:ascii="Trebuchet MS" w:cs="Trebuchet MS" w:eastAsia="Trebuchet MS" w:hAnsi="Trebuchet MS"/>
-                <w:b w:val="false"/>
-                <w:bCs w:val="false"/>
-                <w:i w:val="false"/>
-                <w:iCs w:val="false"/>
-                <w:color w:val="14201A"/>
-                <w:sz w:val="18"/>
-                <w:szCs w:val="18"/>
-              </w:rPr>
-              <w:t xml:space="preserve">Deferred</w:t>
+            <w:r>
+              <w:t>Deferred</w:t>
             </w:r>
           </w:p>
         </w:tc>
@@ -792,21 +701,8 @@
             </w:tcMar>
           </w:tcPr>
           <w:p>
-            <w:pPr>
-              <w:spacing w:after="0" w:line="240"/>
-            </w:pPr>
-            <w:r>
-              <w:rPr>
-                <w:rFonts w:ascii="Trebuchet MS" w:cs="Trebuchet MS" w:eastAsia="Trebuchet MS" w:hAnsi="Trebuchet MS"/>
-                <w:b w:val="false"/>
-                <w:bCs w:val="false"/>
-                <w:i w:val="false"/>
-                <w:iCs w:val="false"/>
-                <w:color w:val="14201A"/>
-                <w:sz w:val="18"/>
-                <w:szCs w:val="18"/>
-              </w:rPr>
-              <w:t xml:space="preserve">Advanced layer controls.</w:t>
+            <w:r>
+              <w:t>Advanced layer controls, national pre-materialized change polygons, and restricted provincial enhancements unless and until written redistribution rights are recorded.</w:t>
             </w:r>
           </w:p>
         </w:tc>
@@ -894,7 +790,766 @@
           <w:sz w:val="20"/>
           <w:szCs w:val="20"/>
         </w:rPr>
-        <w:t xml:space="preserve">Purpose. Build a public record of forest change in four Canadian provinces from 1984 to the present. Bring together satellite observations, official forest and disturbance records, wildfire data, recovery signals and source information. Say clearly what the evidence shows, where it came from, how current it is, and what it cannot tell you.</w:t>
+        <w:t>Purpose. Build a public record of forest change across Canada from 1984 to the latest admitted source year, with British Columbia, Alberta, Ontario and Quebec retained as the Big Four focus provinces. Bring together satellite observations, official forest and disturbance records, wildfire data, recovery signals and source information. Say clearly what the evidence shows, where it came from, how current it is, and what it cannot tell you.</w:t>
+      </w:r>
+    </w:p>
+    <w:p>
+      <w:pPr>
+        <w:pStyle w:val="Heading1"/>
+        <w:spacing w:after="140" w:before="340"/>
+      </w:pPr>
+      <w:r>
+        <w:t>Version 2.1 scope amendment, approved 2026-08-25</w:t>
+      </w:r>
+    </w:p>
+    <w:p>
+      <w:pPr>
+        <w:spacing w:after="120" w:line="276"/>
+      </w:pPr>
+      <w:r>
+        <w:t>Precedence. This amendment is binding. It supersedes any conflicting statement elsewhere in this plan that requires annual public artifacts, national pre-materialized change polygons, mandatory ingestion of restricted provincial layers, coverage limited to four provinces, or a new MFA code for each AWS action. Existing annual source evidence remains valid and may be retained internally for provenance, validation and reproducibility.</w:t>
+      </w:r>
+    </w:p>
+    <w:p>
+      <w:pPr>
+        <w:pStyle w:val="Heading2"/>
+        <w:spacing w:after="100" w:before="240"/>
+      </w:pPr>
+      <w:r>
+        <w:t>National product and temporal cadence</w:t>
+      </w:r>
+    </w:p>
+    <w:p>
+      <w:pPr>
+        <w:pStyle w:val="ListParagraph"/>
+        <w:numPr>
+          <w:ilvl w:val="0"/>
+          <w:numId w:val="2"/>
+        </w:numPr>
+        <w:spacing w:after="60" w:line="276"/>
+      </w:pPr>
+      <w:r>
+        <w:t>The baseline covers all Canada. British Columbia, Alberta, Ontario and Quebec remain the required Big Four focus provinces; no province or territory is removed from the national baseline.</w:t>
+      </w:r>
+    </w:p>
+    <w:p>
+      <w:pPr>
+        <w:pStyle w:val="ListParagraph"/>
+        <w:numPr>
+          <w:ilvl w:val="0"/>
+          <w:numId w:val="2"/>
+        </w:numPr>
+        <w:spacing w:after="60" w:line="276"/>
+      </w:pPr>
+      <w:r>
+        <w:t>Publish eleven national forest-condition snapshots for 1984, 1988, 1992, 1996, 2000, 2004, 2008, 2012, 2016, 2020 and 2022.</w:t>
+      </w:r>
+    </w:p>
+    <w:p>
+      <w:pPr>
+        <w:pStyle w:val="ListParagraph"/>
+        <w:numPr>
+          <w:ilvl w:val="0"/>
+          <w:numId w:val="2"/>
+        </w:numPr>
+        <w:spacing w:after="60" w:line="276"/>
+      </w:pPr>
+      <w:r>
+        <w:t>Publish ten change rasters, one for each interval between adjacent snapshots. Each change product summarizes change observed during its whole interval; it is not merely a second endpoint image.</w:t>
+      </w:r>
+    </w:p>
+    <w:p>
+      <w:pPr>
+        <w:pStyle w:val="ListParagraph"/>
+        <w:numPr>
+          <w:ilvl w:val="0"/>
+          <w:numId w:val="2"/>
+        </w:numPr>
+        <w:spacing w:after="60" w:line="276"/>
+      </w:pPr>
+      <w:r>
+        <w:t>Annual NTEMS inputs and the already-derived annual masks and loss rasters may be used internally to calculate the interval products and to preserve lineage. They are not required as separate public time-slider products.</w:t>
+      </w:r>
+    </w:p>
+    <w:p>
+      <w:pPr>
+        <w:pStyle w:val="ListParagraph"/>
+        <w:numPr>
+          <w:ilvl w:val="0"/>
+          <w:numId w:val="2"/>
+        </w:numPr>
+        <w:spacing w:after="60" w:line="276"/>
+      </w:pPr>
+      <w:r>
+        <w:t>Do not materialize a national polygon for every changed cell or patch. Keep the national record raster-first, compute boundary summaries directly from rasters, and generate detailed geometry only on demand or for a specifically approved, bounded enhancement. This removes the national cell-geometry and polygon-materialization storage gate.</w:t>
+      </w:r>
+    </w:p>
+    <w:p>
+      <w:pPr>
+        <w:pStyle w:val="ListParagraph"/>
+        <w:numPr>
+          <w:ilvl w:val="0"/>
+          <w:numId w:val="2"/>
+        </w:numPr>
+        <w:spacing w:after="60" w:line="276"/>
+      </w:pPr>
+      <w:r>
+        <w:t>Google Earth Engine is an optional compute route for scalable raster clipping, interval aggregation and future updates. It is not the archive or the legal source of record, and its use does not replace each dataset's licence. Existing verified local products remain usable; the simplest reproducible route may be used for each admitted run.</w:t>
+      </w:r>
+    </w:p>
+    <w:p>
+      <w:pPr>
+        <w:pStyle w:val="Heading2"/>
+        <w:spacing w:after="100" w:before="240"/>
+      </w:pPr>
+      <w:r>
+        <w:t>Provincial enhancement policy</w:t>
+      </w:r>
+    </w:p>
+    <w:p>
+      <w:pPr>
+        <w:pStyle w:val="ListParagraph"/>
+        <w:numPr>
+          <w:ilvl w:val="0"/>
+          <w:numId w:val="2"/>
+        </w:numPr>
+        <w:spacing w:after="60" w:line="276"/>
+      </w:pPr>
+      <w:r>
+        <w:t>Open provincial sources may proceed through the normal source-ledger, checksum, transformation and admission gates. For Quebec, this includes the cleared MRNF ecoforest and historical wildfire datasets. For British Columbia, it includes only catalogue records whose individual metadata explicitly grants the Open Government Licence - British Columbia or another recorded redistribution licence.</w:t>
+      </w:r>
+    </w:p>
+    <w:p>
+      <w:pPr>
+        <w:pStyle w:val="ListParagraph"/>
+        <w:numPr>
+          <w:ilvl w:val="0"/>
+          <w:numId w:val="2"/>
+        </w:numPr>
+        <w:spacing w:after="60" w:line="276"/>
+      </w:pPr>
+      <w:r>
+        <w:t>Every provincial source marked Access Only, restricted, permission required or otherwise lacking a verified redistribution grant is an optional enhancement. Its absence must not block the national baseline, Big Four province summaries, public launch or later phases.</w:t>
+      </w:r>
+    </w:p>
+    <w:p>
+      <w:pPr>
+        <w:pStyle w:val="ListParagraph"/>
+        <w:numPr>
+          <w:ilvl w:val="0"/>
+          <w:numId w:val="2"/>
+        </w:numPr>
+        <w:spacing w:after="60" w:line="276"/>
+      </w:pPr>
+      <w:r>
+        <w:t>The owner has submitted one copyright-licence request covering the British Columbia Vegetation Resources Inventory, Consolidated Cutblocks / Harvested Areas of BC, and Forest Operations Map cutblocks. The quoted combined fee is CAD 85, but the copyright officer has advised that access or permission is not guaranteed. Status is pending. Do not acquire for redistribution, ingest into a public product, pay a fee, or publish these layers without a written grant whose exact terms are recorded in the source ledger and separately accepted for execution. If permission is denied or never arrives, ship without them.</w:t>
+      </w:r>
+    </w:p>
+    <w:p>
+      <w:pPr>
+        <w:pStyle w:val="ListParagraph"/>
+        <w:numPr>
+          <w:ilvl w:val="0"/>
+          <w:numId w:val="2"/>
+        </w:numPr>
+        <w:spacing w:after="60" w:line="276"/>
+      </w:pPr>
+      <w:r>
+        <w:t>The same optional rule applies to any other restricted British Columbia layer and to the live SOPFEU feed unless a written reuse grant is verified. Optional enhancements must be visibly labelled and coverage-bounded when added; their absence must never be represented as zero activity.</w:t>
+      </w:r>
+    </w:p>
+    <w:p>
+      <w:pPr>
+        <w:pStyle w:val="Heading2"/>
+        <w:spacing w:after="100" w:before="240"/>
+      </w:pPr>
+      <w:r>
+        <w:t>Attribution and licensing release gate</w:t>
+      </w:r>
+    </w:p>
+    <w:p>
+      <w:pPr>
+        <w:pStyle w:val="ListParagraph"/>
+        <w:numPr>
+          <w:ilvl w:val="0"/>
+          <w:numId w:val="2"/>
+        </w:numPr>
+        <w:spacing w:after="60" w:line="276"/>
+      </w:pPr>
+      <w:r>
+        <w:t>Build attribution into the product and every downloadable artifact. At minimum, record and display the publisher, dataset title, source URL, licence identifier and link, source edition or effective date, retrieval date, required attribution statement, and a plain-language description of Witness Tree's modifications.</w:t>
+      </w:r>
+    </w:p>
+    <w:p>
+      <w:pPr>
+        <w:pStyle w:val="ListParagraph"/>
+        <w:numPr>
+          <w:ilvl w:val="0"/>
+          <w:numId w:val="2"/>
+        </w:numPr>
+        <w:spacing w:after="60" w:line="276"/>
+      </w:pPr>
+      <w:r>
+        <w:t>Apply the recorded terms for NRCan and other Government of Canada data under the Open Government Licence - Canada; acknowledge USGS for public-domain Landsat imagery; apply the Statistics Canada Open Licence to Statistics Canada boundaries; apply CC BY 4.0 attribution to Quebec MRNF datasets; and apply the Open Government Licence - British Columbia only to BC catalogue records that explicitly specify it.</w:t>
+      </w:r>
+    </w:p>
+    <w:p>
+      <w:pPr>
+        <w:pStyle w:val="ListParagraph"/>
+        <w:numPr>
+          <w:ilvl w:val="0"/>
+          <w:numId w:val="2"/>
+        </w:numPr>
+        <w:spacing w:after="60" w:line="276"/>
+      </w:pPr>
+      <w:r>
+        <w:t>Attribution must appear on the public source page and in a machine-readable sidecar or manifest shipped with bulk downloads. Point-of-use views must identify the source and link to the complete attribution record. A build or release fails closed if any included dataset lacks its exact licence, attribution, redistribution status, source version or modification notice.</w:t>
+      </w:r>
+    </w:p>
+    <w:p>
+      <w:pPr>
+        <w:pStyle w:val="Heading2"/>
+        <w:spacing w:after="100" w:before="240"/>
+      </w:pPr>
+      <w:r>
+        <w:t>AWS archive authentication</w:t>
+      </w:r>
+    </w:p>
+    <w:p>
+      <w:pPr>
+        <w:pStyle w:val="ListParagraph"/>
+        <w:numPr>
+          <w:ilvl w:val="0"/>
+          <w:numId w:val="2"/>
+        </w:numPr>
+        <w:spacing w:after="60" w:line="276"/>
+      </w:pPr>
+      <w:r>
+        <w:t>Retain MFA on the archive role trust. The approved operator enters one fresh TOTP to assume the narrowly scoped archive role once per working session, rather than once per object, multipart part or API action.</w:t>
+      </w:r>
+    </w:p>
+    <w:p>
+      <w:pPr>
+        <w:pStyle w:val="ListParagraph"/>
+        <w:numPr>
+          <w:ilvl w:val="0"/>
+          <w:numId w:val="2"/>
+        </w:numPr>
+        <w:spacing w:after="60" w:line="276"/>
+      </w:pPr>
+      <w:r>
+        <w:t>Request a direct operator-to-role STS session of 43,200 seconds, the AWS maximum of twelve hours. If the role's configured MaxSessionDuration is lower, use no more than that configured maximum and record the shorter setting as an IAM configuration blocker for separately authorized correction. Do not use role chaining, which would reduce the session limit.</w:t>
+      </w:r>
+    </w:p>
+    <w:p>
+      <w:pPr>
+        <w:pStyle w:val="ListParagraph"/>
+        <w:numPr>
+          <w:ilvl w:val="0"/>
+          <w:numId w:val="2"/>
+        </w:numPr>
+        <w:spacing w:after="60" w:line="276"/>
+      </w:pPr>
+      <w:r>
+        <w:t>Reuse the temporary credentials only for actions already authorized by the role policy and the approved run. Keep credentials owner-only and ephemeral, never print or commit them, monitor expiry with a safety margin, and checkpoint provider state before expiry. A later continuation requires one new MFA-backed session and verified resume state, not a new code for every action.</w:t>
+      </w:r>
+    </w:p>
+    <w:p>
+      <w:pPr>
+        <w:pStyle w:val="ListParagraph"/>
+        <w:numPr>
+          <w:ilvl w:val="0"/>
+          <w:numId w:val="2"/>
+        </w:numPr>
+        <w:spacing w:after="60" w:line="276"/>
+      </w:pPr>
+      <w:r>
+        <w:t>This plan amendment authorizes no IAM mutation, AWS storage call, upload or production action. It records the future operating design only.</w:t>
+      </w:r>
+    </w:p>
+    <w:p>
+      <w:pPr>
+        <w:pStyle w:val="Heading2"/>
+        <w:spacing w:after="100" w:before="240"/>
+      </w:pPr>
+      <w:r>
+        <w:t>Phase effects</w:t>
+      </w:r>
+    </w:p>
+    <w:p>
+      <w:pPr>
+        <w:pStyle w:val="ListParagraph"/>
+        <w:numPr>
+          <w:ilvl w:val="0"/>
+          <w:numId w:val="2"/>
+        </w:numPr>
+        <w:spacing w:after="60" w:line="276"/>
+      </w:pPr>
+      <w:r>
+        <w:t>Phase 1 core completion is based on the open national inputs and admitted open provincial sources. Pending optional permissions remain tracked risks, not owner-decision or phase-exit blockers.</w:t>
+      </w:r>
+    </w:p>
+    <w:p>
+      <w:pPr>
+        <w:pStyle w:val="ListParagraph"/>
+        <w:numPr>
+          <w:ilvl w:val="0"/>
+          <w:numId w:val="2"/>
+        </w:numPr>
+        <w:spacing w:after="60" w:line="276"/>
+      </w:pPr>
+      <w:r>
+        <w:t>Phase 2 produces the eleven snapshots and ten interval-change rasters above, national boundary aggregates, lineage, checksums and validation evidence. National polygon materialization and cell geometry are removed from the required Phase 2 path.</w:t>
+      </w:r>
+    </w:p>
+    <w:p>
+      <w:pPr>
+        <w:pStyle w:val="ListParagraph"/>
+        <w:numPr>
+          <w:ilvl w:val="0"/>
+          <w:numId w:val="2"/>
+        </w:numPr>
+        <w:spacing w:after="60" w:line="276"/>
+      </w:pPr>
+      <w:r>
+        <w:t>Phase 3 consumes versioned raster summaries and generated place aggregates. It must tolerate absent optional enhancement fields and show the applicable coverage grade rather than a zero.</w:t>
+      </w:r>
+    </w:p>
+    <w:p>
+      <w:pPr>
+        <w:pStyle w:val="ListParagraph"/>
+        <w:numPr>
+          <w:ilvl w:val="0"/>
+          <w:numId w:val="2"/>
+        </w:numPr>
+        <w:spacing w:after="60" w:line="276"/>
+      </w:pPr>
+      <w:r>
+        <w:t>Phase 4 adds cleared provincial detail when available. It can ship incrementally and is not a prerequisite for the national product.</w:t>
+      </w:r>
+    </w:p>
+    <w:p>
+      <w:pPr>
+        <w:pStyle w:val="Heading2"/>
+        <w:spacing w:after="100" w:before="240"/>
+      </w:pPr>
+      <w:r>
+        <w:t>Verified completion checkpoint through 2026-08-25</w:t>
+      </w:r>
+    </w:p>
+    <w:p>
+      <w:pPr>
+        <w:spacing w:after="120" w:line="276"/>
+      </w:pPr>
+      <w:r>
+        <w:t>Maturity rule. Completed below means the named evidence or implementation exists and passed its recorded checks. It does not mean production admission, public release, scientific validation or an external human checkpoint unless stated explicitly. Phase 1 and Phase 2 percentages are historical evidence-rubric scores under the pre-amendment plan and are not mechanically reused for Version 2.1. Phase 3 has no defensible current cumulative percentage and is recorded by evidence rather than an invented score.</w:t>
+      </w:r>
+    </w:p>
+    <w:p>
+      <w:pPr>
+        <w:pStyle w:val="Heading3"/>
+        <w:spacing w:after="70" w:before="180"/>
+      </w:pPr>
+      <w:r>
+        <w:t>Cross-cutting technical foundation completed</w:t>
+      </w:r>
+    </w:p>
+    <w:p>
+      <w:pPr>
+        <w:pStyle w:val="ListParagraph"/>
+        <w:numPr>
+          <w:ilvl w:val="0"/>
+          <w:numId w:val="2"/>
+        </w:numPr>
+        <w:spacing w:after="60" w:line="276"/>
+      </w:pPr>
+      <w:r>
+        <w:t>The repository contains the bilingual English/French shell and route pairs; place, location, search, methods, source, download, correction, governance, comparison and Explore foundations; Figure-versus-Unknown rules; visible provenance, confidence, coverage and evidence components; and fail-closed source, archive, ingestion, release, event, matching, precedence, denominator, fire-impact and correction contracts.</w:t>
+      </w:r>
+    </w:p>
+    <w:p>
+      <w:pPr>
+        <w:pStyle w:val="ListParagraph"/>
+        <w:numPr>
+          <w:ilvl w:val="0"/>
+          <w:numId w:val="2"/>
+        </w:numPr>
+        <w:spacing w:after="60" w:line="276"/>
+      </w:pPr>
+      <w:r>
+        <w:t>CI and deterministic validators cover bilingual parity, claims, accessibility structure, style and brand tokens, artifact budgets, source status, route identity, checksums and nonproduction boundaries. The public technical preview and its fixtures remain explicitly illustrative, unapproved and nonproduction.</w:t>
+      </w:r>
+    </w:p>
+    <w:p>
+      <w:pPr>
+        <w:pStyle w:val="ListParagraph"/>
+        <w:numPr>
+          <w:ilvl w:val="0"/>
+          <w:numId w:val="2"/>
+        </w:numPr>
+        <w:spacing w:after="60" w:line="276"/>
+      </w:pPr>
+      <w:r>
+        <w:t>No completed technical foundation is evidence of a production geography archive, live operational wildfire feed, managed production account store, outbound alert sender, production map-tile archive or real-data public release.</w:t>
+      </w:r>
+    </w:p>
+    <w:p>
+      <w:pPr>
+        <w:pStyle w:val="Heading3"/>
+        <w:spacing w:after="70" w:before="180"/>
+      </w:pPr>
+      <w:r>
+        <w:t>Phase 1 evidence completed</w:t>
+      </w:r>
+    </w:p>
+    <w:p>
+      <w:pPr>
+        <w:pStyle w:val="ListParagraph"/>
+        <w:numPr>
+          <w:ilvl w:val="0"/>
+          <w:numId w:val="2"/>
+        </w:numPr>
+        <w:spacing w:after="60" w:line="276"/>
+      </w:pPr>
+      <w:r>
+        <w:t>The authoritative 31-row audit records 14.75 raw-evidence credits, a bounded evidence-tracking score of 39.2741935%, nine remotely verified / archived / profiled rows, seven locally verified / profiled rows, two partial rows and thirteen access-blocked rows. Nine rows have complete immutable archive evidence; zero rows have production-admission or production-eligibility proof. The percentage is evidence tracking, not production completion.</w:t>
+      </w:r>
+    </w:p>
+    <w:p>
+      <w:pPr>
+        <w:pStyle w:val="ListParagraph"/>
+        <w:numPr>
+          <w:ilvl w:val="0"/>
+          <w:numId w:val="2"/>
+        </w:numPr>
+        <w:spacing w:after="60" w:line="276"/>
+      </w:pPr>
+      <w:r>
+        <w:t>The nine remotely verified rows are NTEMS annual land cover, NTEMS forest harvest, NTEMS canopy cover, NTEMS canopy height, Quebec current ecoforest, Quebec original/current inventory, Alberta AVI Crown, Alberta AVI post-harvest and Alberta Primary Land and Vegetation Inventory.</w:t>
+      </w:r>
+    </w:p>
+    <w:p>
+      <w:pPr>
+        <w:pStyle w:val="ListParagraph"/>
+        <w:numPr>
+          <w:ilvl w:val="0"/>
+          <w:numId w:val="2"/>
+        </w:numPr>
+        <w:spacing w:after="60" w:line="276"/>
+      </w:pPr>
+      <w:r>
+        <w:t>The seven locally verified rows are the CWFIS, British Columbia, Alberta and Ontario current-wildfire snapshots, Quebec fourth inventory, the 2023 federal-riding edition and the Elections Canada 45th-election files. One federal Elections Canada archive supports the two federal ledger rows and must not be uploaded twice.</w:t>
+      </w:r>
+    </w:p>
+    <w:p>
+      <w:pPr>
+        <w:pStyle w:val="ListParagraph"/>
+        <w:numPr>
+          <w:ilvl w:val="0"/>
+          <w:numId w:val="2"/>
+        </w:numPr>
+        <w:spacing w:after="60" w:line="276"/>
+      </w:pPr>
+      <w:r>
+        <w:t>All 39 NTEMS land-cover years from 1984-2022 were validated on a common 30 m grid, CRS, geotransform, dimensions, Byte band and nodata definition. The known 1991 and 2005 empty raster-attribute-table defects are recorded; affected class statistics remain Unknown rather than zero.</w:t>
+      </w:r>
+    </w:p>
+    <w:p>
+      <w:pPr>
+        <w:pStyle w:val="ListParagraph"/>
+        <w:numPr>
+          <w:ilvl w:val="0"/>
+          <w:numId w:val="2"/>
+        </w:numPr>
+        <w:spacing w:after="60" w:line="276"/>
+      </w:pPr>
+      <w:r>
+        <w:t>The Quebec historical-wildfire lossless local transform completed 94,572 wildfire geometries and 94,572 metadata rows with no missing, empty or invalid geometries. The deterministic Alberta AVI run evaluated 792,443 features, left 791,835 unchanged, repaired 607 and quarantined one without altering the source. The bounded Alberta PLVI repair evidence preserves all 179,087 joined features and twelve recorded repairs; its schema drift remains an ingestion blocker.</w:t>
+      </w:r>
+    </w:p>
+    <w:p>
+      <w:pPr>
+        <w:pStyle w:val="ListParagraph"/>
+        <w:numPr>
+          <w:ilvl w:val="0"/>
+          <w:numId w:val="2"/>
+        </w:numPr>
+        <w:spacing w:after="60" w:line="276"/>
+      </w:pPr>
+      <w:r>
+        <w:t>The Canadian immutable archive, versioning, Object Lock and block-public-access controls were provisioned. The first three canonical promotions - Quebec historical wildfire, Alberta AVI Crown and NRCan 2022 canopy cover - passed remote byte/checksum and retention readback, with COMPLIANCE retention through 2033-08-12. The recorded write-once exercise refused delete, retention-shortening and retention-mode-downgrade attempts.</w:t>
+      </w:r>
+    </w:p>
+    <w:p>
+      <w:pPr>
+        <w:pStyle w:val="ListParagraph"/>
+        <w:numPr>
+          <w:ilvl w:val="0"/>
+          <w:numId w:val="2"/>
+        </w:numPr>
+        <w:spacing w:after="60" w:line="276"/>
+      </w:pPr>
+      <w:r>
+        <w:t>The two exact Quebec current/original payloads and their manifests are reported complete, exact-version verified and retained in COMPLIANCE mode through 2033-08-12; the redacted repository attestation requires its owner-private mode-600 pair for full verification. This is immutable source evidence only. Do not repeat either upload.</w:t>
+      </w:r>
+    </w:p>
+    <w:p>
+      <w:pPr>
+        <w:pStyle w:val="ListParagraph"/>
+        <w:numPr>
+          <w:ilvl w:val="0"/>
+          <w:numId w:val="2"/>
+        </w:numPr>
+        <w:spacing w:after="60" w:line="276"/>
+      </w:pPr>
+      <w:r>
+        <w:t>The Quebec fourth inventory completed local acquisition and profiling of all 56 publisher-defined sheets: 16,177,306,782 archive bytes, all ZIP integrity checks passed, and the profile records 7,489,195 base stand polygons with no missing, empty or invalid base geometry. Its remote immutable promotion remains pending.</w:t>
+      </w:r>
+    </w:p>
+    <w:p>
+      <w:pPr>
+        <w:pStyle w:val="ListParagraph"/>
+        <w:numPr>
+          <w:ilvl w:val="0"/>
+          <w:numId w:val="2"/>
+        </w:numPr>
+        <w:spacing w:after="60" w:line="276"/>
+      </w:pPr>
+      <w:r>
+        <w:t>Access-outreach evidence covers all thirteen access-blocked rows: seven verified new sends, one pre-existing request and eight substantive replies were recorded. The owner's later combined BC VRI / Consolidated Cutblocks / FOM copyright request remains a pending optional-enhancement request, not permission.</w:t>
+      </w:r>
+    </w:p>
+    <w:p>
+      <w:pPr>
+        <w:spacing w:after="120" w:line="276"/>
+      </w:pPr>
+      <w:r>
+        <w:t>Controlling evidence: phase1/all-owner-approvals at 0c4f547814a5855c138df221bfa9d5b2228657b9; data/phase1-current-state-completion-audit.json; data/phase1-production-source-ledger.json; docs/PHASE1_CURRENT_STATE_COMPLETION_AUDIT.md; docs/QC_IMMUTABLE_PROMOTION_PREPARATION.md; and data/qc-fourth-inventory-evidence.json. The later wildfire hardening adds race-safe preflight logic but no archive or score credit.</w:t>
+      </w:r>
+    </w:p>
+    <w:p>
+      <w:pPr>
+        <w:pStyle w:val="Heading3"/>
+        <w:spacing w:after="70" w:before="180"/>
+      </w:pPr>
+      <w:r>
+        <w:t>Phase 2 evidence completed</w:t>
+      </w:r>
+    </w:p>
+    <w:p>
+      <w:pPr>
+        <w:pStyle w:val="ListParagraph"/>
+        <w:numPr>
+          <w:ilvl w:val="0"/>
+          <w:numId w:val="2"/>
+        </w:numPr>
+        <w:spacing w:after="60" w:line="276"/>
+      </w:pPr>
+      <w:r>
+        <w:t>The approved versioned nonproduction national raster run produced 39 annual forest masks, 38 adjacent annual loss rasters and two historical disturbance rasters. All 79 outputs - 23,141,889,028 bytes - passed the recorded checksum, lineage and GeoTIFF readback against 41 checksum-bound inputs. The conservative forest crosswalk is VLCE2 classes 210, 220 and 230; class 81 remains excluded.</w:t>
+      </w:r>
+    </w:p>
+    <w:p>
+      <w:pPr>
+        <w:pStyle w:val="ListParagraph"/>
+        <w:numPr>
+          <w:ilvl w:val="0"/>
+          <w:numId w:val="2"/>
+        </w:numPr>
+        <w:spacing w:after="60" w:line="276"/>
+      </w:pPr>
+      <w:r>
+        <w:t>The exact component inventory completed all 38 loss pairs: 1,384,027,417 loss cells, 303,530,909 four-connected components, 528,596,703 run records and 12,199,309 aliases in 68,322,924,822 retained bytes. The recorded end-to-end interval was 4,676.643920 seconds with zero scratch bytes.</w:t>
+      </w:r>
+    </w:p>
+    <w:p>
+      <w:pPr>
+        <w:pStyle w:val="ListParagraph"/>
+        <w:numPr>
+          <w:ilvl w:val="0"/>
+          <w:numId w:val="2"/>
+        </w:numPr>
+        <w:spacing w:after="60" w:line="276"/>
+      </w:pPr>
+      <w:r>
+        <w:t>The optimized local 1984-1985 pilot completed the first 10,000 finalized components and 13,519 loss cells in 11,355,097 candidate bytes. Its embedded final attestation records 1.355815 seconds whole-operation time, 69,828,608 bytes peak RSS and less than one average vCPU. It is a completed local nonproduction artifact pending formal integration into the checked-in Phase 2 status; it is not release or national-execution admission evidence.</w:t>
+      </w:r>
+    </w:p>
+    <w:p>
+      <w:pPr>
+        <w:pStyle w:val="ListParagraph"/>
+        <w:numPr>
+          <w:ilvl w:val="0"/>
+          <w:numId w:val="2"/>
+        </w:numPr>
+        <w:spacing w:after="60" w:line="276"/>
+      </w:pPr>
+      <w:r>
+        <w:t>Independent audit accepted the checked-in Phase 2 raster and component evidence at 54% under the old annual/polygon-oriented rubric. That score is not production readiness and is not the Version 2.1 raster-first score.</w:t>
+      </w:r>
+    </w:p>
+    <w:p>
+      <w:pPr>
+        <w:pStyle w:val="ListParagraph"/>
+        <w:numPr>
+          <w:ilvl w:val="0"/>
+          <w:numId w:val="2"/>
+        </w:numPr>
+        <w:spacing w:after="60" w:line="276"/>
+      </w:pPr>
+      <w:r>
+        <w:t>Version 2.1 reuses the existing annual masks and loss rasters to generate the eleven selected snapshots and ten interval products. The exact component inventory and pilot remain useful method evidence, but national patch polygons and per-cell geometry are no longer required deliverables.</w:t>
+      </w:r>
+    </w:p>
+    <w:p>
+      <w:pPr>
+        <w:spacing w:after="120" w:line="276"/>
+      </w:pPr>
+      <w:r>
+        <w:t>Controlling evidence: phase2/national-baseline-batch at bba1983084c7d665537b8feb61b3423f6ea94535; data/phase2-real-national-execution-evidence.json; docs/PHASE2_REAL_LOSS_COMPONENT_INVENTORY.md; and docs/PLAN_GAP_MATRIX.md. The attested optimized pilot is retained outside Git in the owner-only derived-data tree.</w:t>
+      </w:r>
+    </w:p>
+    <w:p>
+      <w:pPr>
+        <w:pStyle w:val="Heading3"/>
+        <w:spacing w:after="70" w:before="180"/>
+      </w:pPr>
+      <w:r>
+        <w:t>Phase 3 technical foundation completed</w:t>
+      </w:r>
+    </w:p>
+    <w:p>
+      <w:pPr>
+        <w:pStyle w:val="ListParagraph"/>
+        <w:numPr>
+          <w:ilvl w:val="0"/>
+          <w:numId w:val="2"/>
+        </w:numPr>
+        <w:spacing w:after="60" w:line="276"/>
+      </w:pPr>
+      <w:r>
+        <w:t>The deterministic synthetic registry covers eight place types across the Big Four focus provinces: 32 place records plus 32 paired location records, 384 localized records, 192 exact bilingual pairs and 128 localized static place/location pages.</w:t>
+      </w:r>
+    </w:p>
+    <w:p>
+      <w:pPr>
+        <w:pStyle w:val="ListParagraph"/>
+        <w:numPr>
+          <w:ilvl w:val="0"/>
+          <w:numId w:val="2"/>
+        </w:numPr>
+        <w:spacing w:after="60" w:line="276"/>
+      </w:pPr>
+      <w:r>
+        <w:t>The public value model fails closed: a Figure requires evidence, confidence, coverage and provenance; Unknown has no numeric value and requires a bilingual reason, coverage and provenance. The versioned Phase 2 adapter accepts only example, unapproved, nonproduction inputs and validates identities, arithmetic, denominators, years, coverage, versions and lineage.</w:t>
+      </w:r>
+    </w:p>
+    <w:p>
+      <w:pPr>
+        <w:pStyle w:val="ListParagraph"/>
+        <w:numPr>
+          <w:ilvl w:val="0"/>
+          <w:numId w:val="2"/>
+        </w:numPr>
+        <w:spacing w:after="60" w:line="276"/>
+      </w:pPr>
+      <w:r>
+        <w:t>Methods, source ledger, glossary and corrections are generated from one typed bilingual registry. Thirty-two deterministic example CSV downloads have a manifest binding path, media type, byte length, SHA-256, place identity and nonproduction status.</w:t>
+      </w:r>
+    </w:p>
+    <w:p>
+      <w:pPr>
+        <w:pStyle w:val="ListParagraph"/>
+        <w:numPr>
+          <w:ilvl w:val="0"/>
+          <w:numId w:val="2"/>
+        </w:numPr>
+        <w:spacing w:after="60" w:line="276"/>
+      </w:pPr>
+      <w:r>
+        <w:t>The automated built-browser audit covers fourteen English/French routes across seven templates. The recorded laboratory result has a maximum local LCP of 736 ms, zero axe violations, zero keyboard failures, zero forced-colour failures and zero 320-CSS-pixel reflow failures. Route, language, landmark, focus, cue and evidence-integrity validators include negative tamper cases.</w:t>
+      </w:r>
+    </w:p>
+    <w:p>
+      <w:pPr>
+        <w:pStyle w:val="ListParagraph"/>
+        <w:numPr>
+          <w:ilvl w:val="0"/>
+          <w:numId w:val="2"/>
+        </w:numPr>
+        <w:spacing w:after="60" w:line="276"/>
+      </w:pPr>
+      <w:r>
+        <w:t>The Phase 3 external-checkpoint protocol and fail-closed empty evidence envelope are execution-ready. No moderated usability participants, human keyboard or screen-reader review, human forced-colour/CVD review, field performance or independent WCAG 2.2 AA / EN 301 549 report has been recorded.</w:t>
+      </w:r>
+    </w:p>
+    <w:p>
+      <w:pPr>
+        <w:spacing w:after="120" w:line="276"/>
+      </w:pPr>
+      <w:r>
+        <w:t>Controlling evidence: phase3/registry-page-model at d9860988ab490c1946e8dfda6333d894fd8d0970; docs/PHASE3_REGISTRY_GENERATOR.md; docs/PHASE3_STRUCTURAL_REGISTRY.md; docs/PHASE3_BROWSER_AUDIT.md; data/phase3-browser-audit-summary.json; and data/phase3-external-checkpoint-evidence.json. Phase 3 is not re-scored here because its older percentages are stale or explicitly non-cumulative.</w:t>
+      </w:r>
+    </w:p>
+    <w:p>
+      <w:pPr>
+        <w:pStyle w:val="Heading3"/>
+        <w:spacing w:after="70" w:before="180"/>
+      </w:pPr>
+      <w:r>
+        <w:t>Work still open after this amendment</w:t>
+      </w:r>
+    </w:p>
+    <w:p>
+      <w:pPr>
+        <w:pStyle w:val="ListParagraph"/>
+        <w:numPr>
+          <w:ilvl w:val="0"/>
+          <w:numId w:val="2"/>
+        </w:numPr>
+        <w:spacing w:after="60" w:line="276"/>
+      </w:pPr>
+      <w:r>
+        <w:t>Phase 1: federal archive promotion, Quebec fourth-inventory promotion, six-object current-wildfire archive proof, the normal archive-control exercise, remaining source transformations and admission decisions, French boundary editions, and all real-data release/production admissions. Restricted provincial permissions remain optional enhancements.</w:t>
+      </w:r>
+    </w:p>
+    <w:p>
+      <w:pPr>
+        <w:pStyle w:val="ListParagraph"/>
+        <w:numPr>
+          <w:ilvl w:val="0"/>
+          <w:numId w:val="2"/>
+        </w:numPr>
+        <w:spacing w:after="60" w:line="276"/>
+      </w:pPr>
+      <w:r>
+        <w:t>Phase 2: deterministic creation and validation of the eleven Version 2.1 snapshots and ten interval-change rasters; admitted boundary intersections and raster-derived aggregates; real matching where cleared provincial evidence exists; validation samples and statistics; tiles, downloads, scientific review, release and production admission. Old national polygon execution is removed rather than pending.</w:t>
+      </w:r>
+    </w:p>
+    <w:p>
+      <w:pPr>
+        <w:pStyle w:val="ListParagraph"/>
+        <w:numPr>
+          <w:ilvl w:val="0"/>
+          <w:numId w:val="2"/>
+        </w:numPr>
+        <w:spacing w:after="60" w:line="276"/>
+      </w:pPr>
+      <w:r>
+        <w:t>Phase 3: admit real Phase 2 aggregates; generate real national place/location records, search, maps, tiles and downloads; complete moderated bilingual usability, human accessibility, field performance, outside accessibility review, professional translation, legal review and production content approval.</w:t>
+      </w:r>
+    </w:p>
+    <w:p>
+      <w:pPr>
+        <w:pStyle w:val="ListParagraph"/>
+        <w:numPr>
+          <w:ilvl w:val="0"/>
+          <w:numId w:val="2"/>
+        </w:numPr>
+        <w:spacing w:after="60" w:line="276"/>
+      </w:pPr>
+      <w:r>
+        <w:t>AWS: the twelve-hour MFA-backed session design is approved in the plan only. The role's current MaxSessionDuration has not been read or changed by this plan update, and no AWS or IAM action was performed.</w:t>
       </w:r>
     </w:p>
     <w:p>
@@ -52902,7 +53557,7 @@
         <w:sz w:val="16"/>
         <w:szCs w:val="16"/>
       </w:rPr>
-      <w:t xml:space="preserve">Witness Tree | Implementation Plan v2</w:t>
+      <w:t>Witness Tree | Implementation Plan v2.1</w:t>
     </w:r>
   </w:p>
 </w:hdr>

</xml_diff>